<commit_message>
Ajuste de página no roteiro 2 da cartela 15/10 B
Co-Authored-By: Claude Opus 5.5 <noreply@anthropic.com>
Claude-Session: https://claude.ai/code/session_01EGrxw11y1RieUGZ6R9XQan
</commit_message>
<xml_diff>
--- a/roteiros/curtos/ROTEIROS_15102026_B.docx
+++ b/roteiros/curtos/ROTEIROS_15102026_B.docx
@@ -655,7 +655,7 @@
           <w:sz w:val="18"/>
           <w:szCs w:val="18"/>
         </w:rPr>
-        <w:t xml:space="preserve">• OAB pediu que Gonet não atuasse na petição sobre as mensagens Moraes–Vorcaro, dizendo que o pedido é preventivo e não acusa irregularidade (InfoMoney); associação de delegados (ADPF) pediu o impedimento. Conselho Superior do MPF (25/9/2026, comunicado oficial do MPF): por unanimidade, declarou não ter competência para decidir a suspeição/afastamento de Gonet (o pedido de afastamento foi tido por prejudicado); por 5 x 4, rejeitou a abertura de investigação (Celso Albuquerque, Alexandre Camanho, Hindemburgo Chateaubriant e Nicolao Dino contra; Janice Ascari, Samantha Dobrowolski e José Adonis Callou e mais um a favor de aprofundar). CORRIGIDO em 15/10: o 5 x 4 NÃO foi votação para manter Gonet no caso. O pedido da OAB foi sobre a petição das mensagens Moraes–Vorcaro.</w:t>
+        <w:t xml:space="preserve">• OAB pediu que Gonet não atuasse na petição sobre as mensagens Moraes–Vorcaro, dizendo que o pedido é preventivo e não acusa irregularidade (InfoMoney); associação de delegados (ADPF) pediu o impedimento. Conselho Superior do MPF (25/9/2026, comunicado oficial): unânime sobre não ter competência para decidir suspeição/afastamento; 5 x 4 contra abrir investigação. CORRIGIDO em 15/10. O pedido da OAB foi sobre a petição das mensagens Moraes–Vorcaro.</w:t>
       </w:r>
     </w:p>
     <w:p>
@@ -685,22 +685,22 @@
           <w:sz w:val="18"/>
           <w:szCs w:val="18"/>
         </w:rPr>
-        <w:t xml:space="preserve">• 🟡 Ponto técnico contrário (só para comentários): a PGR e o Dino dizem que partido político não pode pedir medida cautelar penal (CPP, art. 282, § 2º, e art. 3º-A); resposta: o relator tem o dever de proteger a investigação sob sua responsabilidade e o Plenário vai decidir.</w:t>
-      </w:r>
-    </w:p>
-    <w:p>
-      <w:pPr>
-        <w:spacing w:after="40"/>
-      </w:pPr>
-      <w:r>
-        <w:rPr>
-          <w:rFonts w:ascii="Times New Roman" w:cs="Times New Roman" w:eastAsia="Times New Roman" w:hAnsi="Times New Roman"/>
-          <w:i/>
-          <w:iCs/>
-          <w:sz w:val="18"/>
-          <w:szCs w:val="18"/>
-        </w:rPr>
-        <w:t xml:space="preserve">• NÃO citar Dark Horse, emendas do filme, nem a viagem do filho de Gonet a Londres. Prazo de 90 dias não confirmado. Perfil pessoal, sem impulsionar; nada novo em 25/10.</w:t>
+        <w:t xml:space="preserve">• 🟡 Comentários: partido não pode pedir cautelar penal (CPP, art. 282, § 2º; PGR e Dino); resposta: o Plenário vai decidir.</w:t>
+      </w:r>
+    </w:p>
+    <w:p>
+      <w:pPr>
+        <w:spacing w:after="40"/>
+      </w:pPr>
+      <w:r>
+        <w:rPr>
+          <w:rFonts w:ascii="Times New Roman" w:cs="Times New Roman" w:eastAsia="Times New Roman" w:hAnsi="Times New Roman"/>
+          <w:i/>
+          <w:iCs/>
+          <w:sz w:val="18"/>
+          <w:szCs w:val="18"/>
+        </w:rPr>
+        <w:t xml:space="preserve">• NÃO citar Dark Horse nem a viagem do filho de Gonet. Perfil pessoal, sem impulsionar; nada novo em 25/10.</w:t>
       </w:r>
     </w:p>
     <w:p>

</xml_diff>